<commit_message>
docs: đổi tên Mẫu sự kiện trọng yếu thành Quy trình truy xuất tiêu chuẩn theo Nghị định
Co-Authored-By: Claude Opus 5.5 <noreply@anthropic.com>
Claude-Session: https://claude.ai/code/session_01QoHJwAkLKioLy5gHiQ95te
</commit_message>
<xml_diff>
--- a/docs/prd/PRD-Xay-dung-Su-kien-trong-yeu.docx
+++ b/docs/prd/PRD-Xay-dung-Su-kien-trong-yeu.docx
@@ -124,7 +124,7 @@
               <w:jc w:val="left"/>
             </w:pPr>
             <w:r>
-              <w:t xml:space="preserve">Ban hành và quản lý Mẫu sự kiện trọng yếu và dữ liệu then chốt chuyên ngành — chủ thể Cấp 2</w:t>
+              <w:t xml:space="preserve">Ban hành và quản lý Sự kiện trọng yếu và dữ liệu then chốt chuyên ngành — chủ thể Cấp 2</w:t>
             </w:r>
           </w:p>
         </w:tc>
@@ -202,7 +202,7 @@
               <w:jc w:val="left"/>
             </w:pPr>
             <w:r>
-              <w:t xml:space="preserve">6.0</w:t>
+              <w:t xml:space="preserve">6.1</w:t>
             </w:r>
           </w:p>
         </w:tc>
@@ -495,10 +495,23 @@
               <w:t xml:space="preserve">“</w:t>
             </w:r>
             <w:r>
-              <w:t xml:space="preserve">Mẫu sự kiện trọng yếu và dữ liệu then chốt</w:t>
+              <w:t xml:space="preserve">Mẫu CTE/KDE</w:t>
             </w:r>
             <w:r>
               <w:t xml:space="preserve">”</w:t>
+            </w:r>
+            <w:r>
+              <w:t xml:space="preserve">; tài liệu này dùng tên chính thức theo Nghị định là</w:t>
+            </w:r>
+            <w:r>
+              <w:t xml:space="preserve"> </w:t>
+            </w:r>
+            <w:r>
+              <w:rPr>
+                <w:bCs/>
+                <w:b/>
+              </w:rPr>
+              <w:t xml:space="preserve">Sự kiện trọng yếu</w:t>
             </w:r>
             <w:r>
               <w:t xml:space="preserve">.</w:t>
@@ -625,19 +638,19 @@
                 <w:bCs/>
                 <w:b/>
               </w:rPr>
-              <w:t xml:space="preserve">Mẫu sự kiện trọng yếu</w:t>
-            </w:r>
-          </w:p>
-        </w:tc>
-        <w:tc>
-          <w:tcPr/>
-          <w:p>
-            <w:pPr>
-              <w:pStyle w:val="Compact"/>
-              <w:jc w:val="left"/>
-            </w:pPr>
-            <w:r>
-              <w:t xml:space="preserve">Bộ gồm nhiều Sự kiện trọng yếu, được cơ quan quản lý gom lại thành yêu cầu khai báo cho một ngành hàng. Ví dụ: Mẫu</w:t>
+              <w:t xml:space="preserve">Quy trình truy xuất tiêu chuẩn</w:t>
+            </w:r>
+          </w:p>
+        </w:tc>
+        <w:tc>
+          <w:tcPr/>
+          <w:p>
+            <w:pPr>
+              <w:pStyle w:val="Compact"/>
+              <w:jc w:val="left"/>
+            </w:pPr>
+            <w:r>
+              <w:t xml:space="preserve">Bộ gồm nhiều Sự kiện trọng yếu, được cơ quan quản lý gom lại thành yêu cầu khai báo cho một ngành hàng. Ví dụ: Quy trình</w:t>
             </w:r>
             <w:r>
               <w:t xml:space="preserve"> </w:t>
@@ -655,7 +668,7 @@
               <w:t xml:space="preserve"> </w:t>
             </w:r>
             <w:r>
-              <w:t xml:space="preserve">gồm các sự kiện Thu hoạch, Sơ chế, Đóng gói, Xuất kho, Nhận hàng. Mẫu được quản lý ở phân hệ riêng. Mẫu này tương ứng với khái niệm</w:t>
+              <w:t xml:space="preserve">gồm các sự kiện Thu hoạch, Sơ chế, Đóng gói, Xuất kho, Nhận hàng. Quy trình được quản lý ở phân hệ riêng. Quy trình này tương ứng với khái niệm</w:t>
             </w:r>
             <w:r>
               <w:t xml:space="preserve"> </w:t>
@@ -1445,7 +1458,7 @@
           <w:bCs/>
           <w:b/>
         </w:rPr>
-        <w:t xml:space="preserve">Ban hành và quản lý Mẫu sự kiện trọng yếu và dữ liệu then chốt chuyên ngành</w:t>
+        <w:t xml:space="preserve">Ban hành và quản lý Sự kiện trọng yếu và dữ liệu then chốt chuyên ngành</w:t>
       </w:r>
       <w:r>
         <w:rPr>
@@ -1522,7 +1535,7 @@
         <w:pStyle w:val="Compact"/>
       </w:pPr>
       <w:r>
-        <w:t xml:space="preserve">Quản lý danh mục tham chiếu Mẫu sự kiện trọng yếu và dữ liệu then chốt (Cấp 1) — nguồn của thư viện sự kiện mẫu và bộ lõi quốc gia.</w:t>
+        <w:t xml:space="preserve">Quản lý danh mục tham chiếu Sự kiện trọng yếu và dữ liệu then chốt (Cấp 1) — nguồn của thư viện sự kiện mẫu và bộ lõi quốc gia.</w:t>
       </w:r>
     </w:p>
     <w:p>
@@ -1550,7 +1563,7 @@
         <w:pStyle w:val="Compact"/>
       </w:pPr>
       <w:r>
-        <w:t xml:space="preserve">Quản lý danh mục tham chiếu Mẫu sự kiện trọng yếu và dữ liệu then chốt (Cấp 1) — đăng ký phiên bản đã công bố vào danh mục quốc gia.</w:t>
+        <w:t xml:space="preserve">Quản lý danh mục tham chiếu Sự kiện trọng yếu và dữ liệu then chốt (Cấp 1) — đăng ký phiên bản đã công bố vào danh mục quốc gia.</w:t>
       </w:r>
     </w:p>
     <w:p>
@@ -1608,7 +1621,7 @@
       <w:r>
         <w:drawing>
           <wp:inline>
-            <wp:extent cx="5334000" cy="714375"/>
+            <wp:extent cx="5334000" cy="748392"/>
             <wp:effectExtent b="0" l="0" r="0" t="0"/>
             <wp:docPr descr="Sơ đồ 1" title="" id="23" name="Picture"/>
             <a:graphic>
@@ -1629,7 +1642,7 @@
                   <pic:spPr bwMode="auto">
                     <a:xfrm>
                       <a:off x="0" y="0"/>
-                      <a:ext cx="5334000" cy="714375"/>
+                      <a:ext cx="5334000" cy="748392"/>
                     </a:xfrm>
                     <a:prstGeom prst="rect">
                       <a:avLst/>
@@ -1779,7 +1792,7 @@
         <w:t xml:space="preserve"> </w:t>
       </w:r>
       <w:r>
-        <w:t xml:space="preserve">tự xây dựng, phê duyệt, công bố và duy trì các Sự kiện trọng yếu cho ngành hàng mình quản lý, mà không cần đội kỹ thuật hỗ trợ. Một Sự kiện trọng yếu được ban hành qua phân hệ phải đáp ứng đầy đủ yêu cầu của Quyển 2 với một Mẫu sự kiện trọng yếu, gồm:</w:t>
+        <w:t xml:space="preserve">tự xây dựng, phê duyệt, công bố và duy trì các Sự kiện trọng yếu cho ngành hàng mình quản lý, mà không cần đội kỹ thuật hỗ trợ. Một Sự kiện trọng yếu được ban hành qua phân hệ phải đáp ứng đầy đủ yêu cầu của Quyển 2 với một Sự kiện trọng yếu, gồm:</w:t>
       </w:r>
       <w:r>
         <w:t xml:space="preserve"> </w:t>
@@ -2574,7 +2587,7 @@
               <w:jc w:val="left"/>
             </w:pPr>
             <w:r>
-              <w:t xml:space="preserve">Sự kiện và Mẫu sự kiện đang gộp làm một.</w:t>
+              <w:t xml:space="preserve">Sự kiện trọng yếu và Quy trình truy xuất tiêu chuẩn đang gộp làm một.</w:t>
             </w:r>
           </w:p>
         </w:tc>
@@ -2598,7 +2611,7 @@
               <w:jc w:val="left"/>
             </w:pPr>
             <w:r>
-              <w:t xml:space="preserve">Phân hệ này chỉ xây dựng từng Sự kiện trọng yếu. Việc gom thành Mẫu theo ngành hàng do phân hệ riêng đảm nhiệm.</w:t>
+              <w:t xml:space="preserve">Phân hệ này chỉ xây dựng từng Sự kiện trọng yếu. Việc gom thành Quy trình theo ngành hàng do phân hệ riêng đảm nhiệm.</w:t>
             </w:r>
           </w:p>
         </w:tc>
@@ -3771,19 +3784,19 @@
               <w:jc w:val="left"/>
             </w:pPr>
             <w:r>
-              <w:t xml:space="preserve">Gom Sự kiện trọng yếu thành Mẫu sự kiện trọng yếu theo ngành hàng</w:t>
-            </w:r>
-          </w:p>
-        </w:tc>
-        <w:tc>
-          <w:tcPr/>
-          <w:p>
-            <w:pPr>
-              <w:pStyle w:val="Compact"/>
-              <w:jc w:val="left"/>
-            </w:pPr>
-            <w:r>
-              <w:t xml:space="preserve">Phân hệ Quản lý Mẫu sự kiện trọng yếu</w:t>
+              <w:t xml:space="preserve">Gom Sự kiện trọng yếu thành Quy trình truy xuất tiêu chuẩn theo ngành hàng</w:t>
+            </w:r>
+          </w:p>
+        </w:tc>
+        <w:tc>
+          <w:tcPr/>
+          <w:p>
+            <w:pPr>
+              <w:pStyle w:val="Compact"/>
+              <w:jc w:val="left"/>
+            </w:pPr>
+            <w:r>
+              <w:t xml:space="preserve">Phân hệ Quản lý Quy trình truy xuất tiêu chuẩn</w:t>
             </w:r>
           </w:p>
         </w:tc>
@@ -4055,7 +4068,7 @@
         <w:pStyle w:val="FirstParagraph"/>
       </w:pPr>
       <w:r>
-        <w:t xml:space="preserve">Theo Quyển 2, mỗi Mẫu sự kiện trọng yếu phải có mã, tên, chủ sở hữu nội dung, nguồn thẩm quyền, phạm vi ngành và sản phẩm, phiên bản, ngày hiệu lực, trạng thái, thời hạn cập nhật và quy tắc chuyển tiếp. Phân hệ quản lý các thông tin sau:</w:t>
+        <w:t xml:space="preserve">Theo Quyển 2, mỗi Sự kiện trọng yếu phải có mã, tên, chủ sở hữu nội dung, nguồn thẩm quyền, phạm vi ngành và sản phẩm, phiên bản, ngày hiệu lực, trạng thái, thời hạn cập nhật và quy tắc chuyển tiếp. Phân hệ quản lý các thông tin sau:</w:t>
       </w:r>
     </w:p>
     <w:tbl>
@@ -9629,7 +9642,7 @@
         <w:t xml:space="preserve"> </w:t>
       </w:r>
       <w:r>
-        <w:t xml:space="preserve">không cho phép xoá bản nháp đang nằm trong một Mẫu sự kiện trọng yếu, kể cả Mẫu ở trạng thái nháp.</w:t>
+        <w:t xml:space="preserve">không cho phép xoá bản nháp đang nằm trong một Quy trình truy xuất tiêu chuẩn, kể cả Quy trình ở trạng thái nháp.</w:t>
       </w:r>
       <w:r>
         <w:t xml:space="preserve"> </w:t>
@@ -9645,7 +9658,7 @@
         <w:t xml:space="preserve"> </w:t>
       </w:r>
       <w:r>
-        <w:t xml:space="preserve">liệt kê tên các Mẫu đang chứa sự kiện đó.</w:t>
+        <w:t xml:space="preserve">liệt kê tên các Quy trình đang chứa sự kiện đó.</w:t>
       </w:r>
     </w:p>
     <w:p>
@@ -10120,7 +10133,7 @@
           <w:bCs/>
           <w:b/>
         </w:rPr>
-        <w:t xml:space="preserve">QT-30. Không ngừng áp dụng khi đang trong Mẫu hiệu lực.</w:t>
+        <w:t xml:space="preserve">QT-30. Không ngừng áp dụng khi đang trong Quy trình hiệu lực.</w:t>
       </w:r>
       <w:r>
         <w:t xml:space="preserve"> </w:t>
@@ -10136,7 +10149,7 @@
         <w:t xml:space="preserve"> </w:t>
       </w:r>
       <w:r>
-        <w:t xml:space="preserve">không cho phép ngừng áp dụng một Sự kiện trọng yếu đang nằm trong Mẫu sự kiện trọng yếu đang áp dụng.</w:t>
+        <w:t xml:space="preserve">không cho phép ngừng áp dụng một Sự kiện trọng yếu đang nằm trong Quy trình truy xuất tiêu chuẩn đang áp dụng.</w:t>
       </w:r>
       <w:r>
         <w:t xml:space="preserve"> </w:t>
@@ -10152,7 +10165,7 @@
         <w:t xml:space="preserve"> </w:t>
       </w:r>
       <w:r>
-        <w:t xml:space="preserve">phải gỡ sự kiện khỏi Mẫu trước.</w:t>
+        <w:t xml:space="preserve">phải gỡ sự kiện khỏi Quy trình trước.</w:t>
       </w:r>
       <w:r>
         <w:t xml:space="preserve"> </w:t>
@@ -11141,7 +11154,7 @@
         <w:t xml:space="preserve"> </w:t>
       </w:r>
       <w:r>
-        <w:t xml:space="preserve">Tính năng cho phép cán bộ tiêu chuẩn khai báo các thông tin mà Quyển 2 yêu cầu với mọi Mẫu sự kiện trọng yếu: căn cứ ban hành, nhóm sản phẩm áp dụng, vai trò chủ thể phải ghi nhận, cơ quan chủ trì và cơ quan phối hợp (nếu liên ngành), văn bản uỷ quyền (với nhóm 2B khi kế thừa). Thông tin này nằm ở thẻ</w:t>
+        <w:t xml:space="preserve">Tính năng cho phép cán bộ tiêu chuẩn khai báo các thông tin mà Quyển 2 yêu cầu với mọi Sự kiện trọng yếu: căn cứ ban hành, nhóm sản phẩm áp dụng, vai trò chủ thể phải ghi nhận, cơ quan chủ trì và cơ quan phối hợp (nếu liên ngành), văn bản uỷ quyền (với nhóm 2B khi kế thừa). Thông tin này nằm ở thẻ</w:t>
       </w:r>
       <w:r>
         <w:t xml:space="preserve"> </w:t>
@@ -11406,7 +11419,7 @@
         <w:t xml:space="preserve">“</w:t>
       </w:r>
       <w:r>
-        <w:t xml:space="preserve">Đang được dùng trong Mẫu</w:t>
+        <w:t xml:space="preserve">Đang được dùng trong Quy trình</w:t>
       </w:r>
       <w:r>
         <w:t xml:space="preserve">”</w:t>
@@ -11486,7 +11499,7 @@
         <w:t xml:space="preserve"> </w:t>
       </w:r>
       <w:r>
-        <w:t xml:space="preserve">- Là cán bộ tiêu chuẩn, tôi muốn biết Sự kiện trọng yếu đang nằm trong những Mẫu nào, để đánh giá ảnh hưởng trước khi thay đổi.</w:t>
+        <w:t xml:space="preserve">- Là cán bộ tiêu chuẩn, tôi muốn biết Sự kiện trọng yếu đang nằm trong những Quy trình nào, để đánh giá ảnh hưởng trước khi thay đổi.</w:t>
       </w:r>
       <w:r>
         <w:t xml:space="preserve"> </w:t>
@@ -11764,7 +11777,7 @@
         <w:t xml:space="preserve"> </w:t>
       </w:r>
       <w:r>
-        <w:t xml:space="preserve">- Hệ thống không cho xoá bản đã trình, bản đã công bố, và bản nháp đang nằm trong một Mẫu sự kiện trọng yếu.</w:t>
+        <w:t xml:space="preserve">- Hệ thống không cho xoá bản đã trình, bản đã công bố, và bản nháp đang nằm trong một Quy trình truy xuất tiêu chuẩn.</w:t>
       </w:r>
       <w:r>
         <w:t xml:space="preserve"> </w:t>
@@ -11794,7 +11807,7 @@
         <w:t xml:space="preserve"> </w:t>
       </w:r>
       <w:r>
-        <w:t xml:space="preserve">- Là cán bộ tiêu chuẩn, tôi muốn biết bản nháp đang nằm trong Mẫu nào khi không xoá được, để xử lý đúng chỗ.</w:t>
+        <w:t xml:space="preserve">- Là cán bộ tiêu chuẩn, tôi muốn biết bản nháp đang nằm trong Quy trình nào khi không xoá được, để xử lý đúng chỗ.</w:t>
       </w:r>
     </w:p>
     <w:p>
@@ -13725,7 +13738,7 @@
       <w:r>
         <w:drawing>
           <wp:inline>
-            <wp:extent cx="5334000" cy="14793836"/>
+            <wp:extent cx="5334000" cy="15188338"/>
             <wp:effectExtent b="0" l="0" r="0" t="0"/>
             <wp:docPr descr="Sơ đồ 13" title="" id="100" name="Picture"/>
             <a:graphic>
@@ -13746,7 +13759,7 @@
                   <pic:spPr bwMode="auto">
                     <a:xfrm>
                       <a:off x="0" y="0"/>
-                      <a:ext cx="5334000" cy="14793836"/>
+                      <a:ext cx="5334000" cy="15188338"/>
                     </a:xfrm>
                     <a:prstGeom prst="rect">
                       <a:avLst/>
@@ -14135,7 +14148,7 @@
         <w:pStyle w:val="Compact"/>
       </w:pPr>
       <w:r>
-        <w:t xml:space="preserve">Hệ thống không cho thực hiện khi Sự kiện trọng yếu đang nằm trong Mẫu sự kiện trọng yếu đang áp dụng.</w:t>
+        <w:t xml:space="preserve">Hệ thống không cho thực hiện khi Sự kiện trọng yếu đang nằm trong Quy trình truy xuất tiêu chuẩn đang áp dụng.</w:t>
       </w:r>
     </w:p>
     <w:p>
@@ -15042,7 +15055,7 @@
               <w:jc w:val="left"/>
             </w:pPr>
             <w:r>
-              <w:t xml:space="preserve">Xoá khi đang trong Mẫu</w:t>
+              <w:t xml:space="preserve">Xoá khi đang trong Quy trình</w:t>
             </w:r>
           </w:p>
         </w:tc>
@@ -15066,7 +15079,7 @@
               <w:jc w:val="left"/>
             </w:pPr>
             <w:r>
-              <w:t xml:space="preserve">Sự kiện trọng yếu đang nằm trong Mẫu sự kiện trọng yếu: [danh sách].</w:t>
+              <w:t xml:space="preserve">Sự kiện trọng yếu đang nằm trong Quy trình truy xuất tiêu chuẩn: [danh sách].</w:t>
             </w:r>
           </w:p>
         </w:tc>
@@ -16592,7 +16605,7 @@
               <w:jc w:val="left"/>
             </w:pPr>
             <w:r>
-              <w:t xml:space="preserve">Quản lý danh mục tham chiếu Mẫu sự kiện trọng yếu và dữ liệu then chốt</w:t>
+              <w:t xml:space="preserve">Quản lý danh mục tham chiếu Sự kiện trọng yếu và dữ liệu then chốt</w:t>
             </w:r>
           </w:p>
         </w:tc>
@@ -16992,7 +17005,7 @@
               <w:jc w:val="left"/>
             </w:pPr>
             <w:r>
-              <w:t xml:space="preserve">Quản lý Mẫu sự kiện trọng yếu theo ngành hàng</w:t>
+              <w:t xml:space="preserve">Quản lý Quy trình truy xuất tiêu chuẩn theo ngành hàng</w:t>
             </w:r>
           </w:p>
         </w:tc>
@@ -17016,7 +17029,7 @@
               <w:jc w:val="left"/>
             </w:pPr>
             <w:r>
-              <w:t xml:space="preserve">Mẫu chỉ gom Sự kiện trọng yếu Đang áp dụng; phân hệ này hỏi Mẫu để biết sự kiện có đang nằm trong Mẫu không trước khi xoá, ngừng áp dụng</w:t>
+              <w:t xml:space="preserve">Quy trình chỉ gom Sự kiện trọng yếu Đang áp dụng; phân hệ này hỏi Quy trình để biết sự kiện có đang nằm trong Quy trình không trước khi xoá, ngừng áp dụng</w:t>
             </w:r>
           </w:p>
         </w:tc>
@@ -17042,7 +17055,7 @@
               <w:jc w:val="left"/>
             </w:pPr>
             <w:r>
-              <w:t xml:space="preserve">Quản lý danh mục tham chiếu Mẫu sự kiện trọng yếu và dữ liệu then chốt</w:t>
+              <w:t xml:space="preserve">Quản lý danh mục tham chiếu Sự kiện trọng yếu và dữ liệu then chốt</w:t>
             </w:r>
           </w:p>
         </w:tc>

</xml_diff>